<commit_message>
Signed-off-by: khoalhdtb02020-max <khoalhdtb02020@gmail.com> cập nhật
</commit_message>
<xml_diff>
--- a/TB02020_LAb8.docx
+++ b/TB02020_LAb8.docx
@@ -37,6 +37,7 @@
       </w:pPr>
       <w:r>
         <w:rPr>
+          <w:noProof/>
           <w:lang w:val="vi-VN"/>
         </w:rPr>
         <w:drawing>
@@ -87,6 +88,506 @@
           <w:lang w:val="vi-VN"/>
         </w:rPr>
         <w:t>SEQUENCE DIAGRAM</w:t>
+      </w:r>
+    </w:p>
+    <w:p>
+      <w:pPr>
+        <w:rPr>
+          <w:lang w:val="vi-VN"/>
+        </w:rPr>
+      </w:pPr>
+      <w:r>
+        <w:rPr>
+          <w:lang w:val="vi-VN"/>
+        </w:rPr>
+        <w:t>Thêm:</w:t>
+      </w:r>
+    </w:p>
+    <w:p>
+      <w:pPr>
+        <w:rPr>
+          <w:lang w:val="vi-VN"/>
+        </w:rPr>
+      </w:pPr>
+      <w:r>
+        <w:rPr>
+          <w:lang w:val="vi-VN"/>
+        </w:rPr>
+        <w:lastRenderedPageBreak/>
+        <w:drawing>
+          <wp:inline distT="0" distB="0" distL="0" distR="0" wp14:anchorId="31C9F36B" wp14:editId="15833BD0">
+            <wp:extent cx="5943600" cy="5347335"/>
+            <wp:effectExtent l="0" t="0" r="0" b="5715"/>
+            <wp:docPr id="1477208542" name="Hình ảnh 1"/>
+            <wp:cNvGraphicFramePr>
+              <a:graphicFrameLocks xmlns:a="http://schemas.openxmlformats.org/drawingml/2006/main" noChangeAspect="1"/>
+            </wp:cNvGraphicFramePr>
+            <a:graphic xmlns:a="http://schemas.openxmlformats.org/drawingml/2006/main">
+              <a:graphicData uri="http://schemas.openxmlformats.org/drawingml/2006/picture">
+                <pic:pic xmlns:pic="http://schemas.openxmlformats.org/drawingml/2006/picture">
+                  <pic:nvPicPr>
+                    <pic:cNvPr id="1477208542" name=""/>
+                    <pic:cNvPicPr/>
+                  </pic:nvPicPr>
+                  <pic:blipFill>
+                    <a:blip r:embed="rId5"/>
+                    <a:stretch>
+                      <a:fillRect/>
+                    </a:stretch>
+                  </pic:blipFill>
+                  <pic:spPr>
+                    <a:xfrm>
+                      <a:off x="0" y="0"/>
+                      <a:ext cx="5943600" cy="5347335"/>
+                    </a:xfrm>
+                    <a:prstGeom prst="rect">
+                      <a:avLst/>
+                    </a:prstGeom>
+                  </pic:spPr>
+                </pic:pic>
+              </a:graphicData>
+            </a:graphic>
+          </wp:inline>
+        </w:drawing>
+      </w:r>
+    </w:p>
+    <w:p>
+      <w:pPr>
+        <w:rPr>
+          <w:lang w:val="vi-VN"/>
+        </w:rPr>
+      </w:pPr>
+      <w:r>
+        <w:rPr>
+          <w:lang w:val="vi-VN"/>
+        </w:rPr>
+        <w:t>Xóa</w:t>
+      </w:r>
+    </w:p>
+    <w:p>
+      <w:pPr>
+        <w:rPr>
+          <w:lang w:val="vi-VN"/>
+        </w:rPr>
+      </w:pPr>
+      <w:r>
+        <w:rPr>
+          <w:lang w:val="vi-VN"/>
+        </w:rPr>
+        <w:lastRenderedPageBreak/>
+        <w:drawing>
+          <wp:inline distT="0" distB="0" distL="0" distR="0" wp14:anchorId="26D114CA" wp14:editId="6CBCDBCB">
+            <wp:extent cx="5943600" cy="5479415"/>
+            <wp:effectExtent l="0" t="0" r="0" b="6985"/>
+            <wp:docPr id="1355535735" name="Hình ảnh 1"/>
+            <wp:cNvGraphicFramePr>
+              <a:graphicFrameLocks xmlns:a="http://schemas.openxmlformats.org/drawingml/2006/main" noChangeAspect="1"/>
+            </wp:cNvGraphicFramePr>
+            <a:graphic xmlns:a="http://schemas.openxmlformats.org/drawingml/2006/main">
+              <a:graphicData uri="http://schemas.openxmlformats.org/drawingml/2006/picture">
+                <pic:pic xmlns:pic="http://schemas.openxmlformats.org/drawingml/2006/picture">
+                  <pic:nvPicPr>
+                    <pic:cNvPr id="1355535735" name=""/>
+                    <pic:cNvPicPr/>
+                  </pic:nvPicPr>
+                  <pic:blipFill>
+                    <a:blip r:embed="rId6"/>
+                    <a:stretch>
+                      <a:fillRect/>
+                    </a:stretch>
+                  </pic:blipFill>
+                  <pic:spPr>
+                    <a:xfrm>
+                      <a:off x="0" y="0"/>
+                      <a:ext cx="5943600" cy="5479415"/>
+                    </a:xfrm>
+                    <a:prstGeom prst="rect">
+                      <a:avLst/>
+                    </a:prstGeom>
+                  </pic:spPr>
+                </pic:pic>
+              </a:graphicData>
+            </a:graphic>
+          </wp:inline>
+        </w:drawing>
+      </w:r>
+    </w:p>
+    <w:p>
+      <w:pPr>
+        <w:rPr>
+          <w:lang w:val="vi-VN"/>
+        </w:rPr>
+      </w:pPr>
+      <w:r>
+        <w:rPr>
+          <w:lang w:val="vi-VN"/>
+        </w:rPr>
+        <w:t>tìm kiếm</w:t>
+      </w:r>
+    </w:p>
+    <w:p>
+      <w:pPr>
+        <w:rPr>
+          <w:lang w:val="vi-VN"/>
+        </w:rPr>
+      </w:pPr>
+      <w:r>
+        <w:rPr>
+          <w:lang w:val="vi-VN"/>
+        </w:rPr>
+        <w:lastRenderedPageBreak/>
+        <w:drawing>
+          <wp:inline distT="0" distB="0" distL="0" distR="0" wp14:anchorId="17F5D449" wp14:editId="4ABDC96B">
+            <wp:extent cx="5943600" cy="5853430"/>
+            <wp:effectExtent l="0" t="0" r="0" b="0"/>
+            <wp:docPr id="444616743" name="Hình ảnh 1"/>
+            <wp:cNvGraphicFramePr>
+              <a:graphicFrameLocks xmlns:a="http://schemas.openxmlformats.org/drawingml/2006/main" noChangeAspect="1"/>
+            </wp:cNvGraphicFramePr>
+            <a:graphic xmlns:a="http://schemas.openxmlformats.org/drawingml/2006/main">
+              <a:graphicData uri="http://schemas.openxmlformats.org/drawingml/2006/picture">
+                <pic:pic xmlns:pic="http://schemas.openxmlformats.org/drawingml/2006/picture">
+                  <pic:nvPicPr>
+                    <pic:cNvPr id="444616743" name=""/>
+                    <pic:cNvPicPr/>
+                  </pic:nvPicPr>
+                  <pic:blipFill>
+                    <a:blip r:embed="rId7"/>
+                    <a:stretch>
+                      <a:fillRect/>
+                    </a:stretch>
+                  </pic:blipFill>
+                  <pic:spPr>
+                    <a:xfrm>
+                      <a:off x="0" y="0"/>
+                      <a:ext cx="5943600" cy="5853430"/>
+                    </a:xfrm>
+                    <a:prstGeom prst="rect">
+                      <a:avLst/>
+                    </a:prstGeom>
+                  </pic:spPr>
+                </pic:pic>
+              </a:graphicData>
+            </a:graphic>
+          </wp:inline>
+        </w:drawing>
+      </w:r>
+    </w:p>
+    <w:p>
+      <w:pPr>
+        <w:rPr>
+          <w:lang w:val="vi-VN"/>
+        </w:rPr>
+      </w:pPr>
+      <w:r>
+        <w:rPr>
+          <w:lang w:val="vi-VN"/>
+        </w:rPr>
+        <w:t>Cập nhật</w:t>
+      </w:r>
+    </w:p>
+    <w:p>
+      <w:pPr>
+        <w:rPr>
+          <w:lang w:val="vi-VN"/>
+        </w:rPr>
+      </w:pPr>
+      <w:r>
+        <w:rPr>
+          <w:lang w:val="vi-VN"/>
+        </w:rPr>
+        <w:lastRenderedPageBreak/>
+        <w:drawing>
+          <wp:inline distT="0" distB="0" distL="0" distR="0" wp14:anchorId="40DB0469" wp14:editId="3D744A9B">
+            <wp:extent cx="5943600" cy="4862195"/>
+            <wp:effectExtent l="0" t="0" r="0" b="0"/>
+            <wp:docPr id="1437783778" name="Hình ảnh 1"/>
+            <wp:cNvGraphicFramePr>
+              <a:graphicFrameLocks xmlns:a="http://schemas.openxmlformats.org/drawingml/2006/main" noChangeAspect="1"/>
+            </wp:cNvGraphicFramePr>
+            <a:graphic xmlns:a="http://schemas.openxmlformats.org/drawingml/2006/main">
+              <a:graphicData uri="http://schemas.openxmlformats.org/drawingml/2006/picture">
+                <pic:pic xmlns:pic="http://schemas.openxmlformats.org/drawingml/2006/picture">
+                  <pic:nvPicPr>
+                    <pic:cNvPr id="1437783778" name=""/>
+                    <pic:cNvPicPr/>
+                  </pic:nvPicPr>
+                  <pic:blipFill>
+                    <a:blip r:embed="rId8"/>
+                    <a:stretch>
+                      <a:fillRect/>
+                    </a:stretch>
+                  </pic:blipFill>
+                  <pic:spPr>
+                    <a:xfrm>
+                      <a:off x="0" y="0"/>
+                      <a:ext cx="5943600" cy="4862195"/>
+                    </a:xfrm>
+                    <a:prstGeom prst="rect">
+                      <a:avLst/>
+                    </a:prstGeom>
+                  </pic:spPr>
+                </pic:pic>
+              </a:graphicData>
+            </a:graphic>
+          </wp:inline>
+        </w:drawing>
+      </w:r>
+    </w:p>
+    <w:p>
+      <w:pPr>
+        <w:rPr>
+          <w:lang w:val="vi-VN"/>
+        </w:rPr>
+      </w:pPr>
+      <w:r>
+        <w:rPr>
+          <w:lang w:val="vi-VN"/>
+        </w:rPr>
+        <w:t xml:space="preserve">Activity </w:t>
+      </w:r>
+    </w:p>
+    <w:p>
+      <w:pPr>
+        <w:rPr>
+          <w:lang w:val="vi-VN"/>
+        </w:rPr>
+      </w:pPr>
+      <w:r>
+        <w:rPr>
+          <w:lang w:val="vi-VN"/>
+        </w:rPr>
+        <w:lastRenderedPageBreak/>
+        <w:t>Thêm</w:t>
+      </w:r>
+      <w:r>
+        <w:rPr>
+          <w:lang w:val="vi-VN"/>
+        </w:rPr>
+        <w:br/>
+      </w:r>
+      <w:r>
+        <w:rPr>
+          <w:lang w:val="vi-VN"/>
+        </w:rPr>
+        <w:drawing>
+          <wp:inline distT="0" distB="0" distL="0" distR="0" wp14:anchorId="6038CBA9" wp14:editId="7ED4F3D5">
+            <wp:extent cx="5943600" cy="4632325"/>
+            <wp:effectExtent l="0" t="0" r="0" b="0"/>
+            <wp:docPr id="1647788059" name="Hình ảnh 1"/>
+            <wp:cNvGraphicFramePr>
+              <a:graphicFrameLocks xmlns:a="http://schemas.openxmlformats.org/drawingml/2006/main" noChangeAspect="1"/>
+            </wp:cNvGraphicFramePr>
+            <a:graphic xmlns:a="http://schemas.openxmlformats.org/drawingml/2006/main">
+              <a:graphicData uri="http://schemas.openxmlformats.org/drawingml/2006/picture">
+                <pic:pic xmlns:pic="http://schemas.openxmlformats.org/drawingml/2006/picture">
+                  <pic:nvPicPr>
+                    <pic:cNvPr id="1647788059" name=""/>
+                    <pic:cNvPicPr/>
+                  </pic:nvPicPr>
+                  <pic:blipFill>
+                    <a:blip r:embed="rId9"/>
+                    <a:stretch>
+                      <a:fillRect/>
+                    </a:stretch>
+                  </pic:blipFill>
+                  <pic:spPr>
+                    <a:xfrm>
+                      <a:off x="0" y="0"/>
+                      <a:ext cx="5943600" cy="4632325"/>
+                    </a:xfrm>
+                    <a:prstGeom prst="rect">
+                      <a:avLst/>
+                    </a:prstGeom>
+                  </pic:spPr>
+                </pic:pic>
+              </a:graphicData>
+            </a:graphic>
+          </wp:inline>
+        </w:drawing>
+      </w:r>
+    </w:p>
+    <w:p>
+      <w:pPr>
+        <w:rPr>
+          <w:lang w:val="vi-VN"/>
+        </w:rPr>
+      </w:pPr>
+      <w:r>
+        <w:rPr>
+          <w:lang w:val="vi-VN"/>
+        </w:rPr>
+        <w:t>Cập nhật</w:t>
+      </w:r>
+    </w:p>
+    <w:p>
+      <w:pPr>
+        <w:rPr>
+          <w:lang w:val="vi-VN"/>
+        </w:rPr>
+      </w:pPr>
+      <w:r>
+        <w:rPr>
+          <w:lang w:val="vi-VN"/>
+        </w:rPr>
+        <w:lastRenderedPageBreak/>
+        <w:drawing>
+          <wp:inline distT="0" distB="0" distL="0" distR="0" wp14:anchorId="552CC5ED" wp14:editId="71C5D874">
+            <wp:extent cx="5943600" cy="4027170"/>
+            <wp:effectExtent l="0" t="0" r="0" b="0"/>
+            <wp:docPr id="940812342" name="Hình ảnh 1"/>
+            <wp:cNvGraphicFramePr>
+              <a:graphicFrameLocks xmlns:a="http://schemas.openxmlformats.org/drawingml/2006/main" noChangeAspect="1"/>
+            </wp:cNvGraphicFramePr>
+            <a:graphic xmlns:a="http://schemas.openxmlformats.org/drawingml/2006/main">
+              <a:graphicData uri="http://schemas.openxmlformats.org/drawingml/2006/picture">
+                <pic:pic xmlns:pic="http://schemas.openxmlformats.org/drawingml/2006/picture">
+                  <pic:nvPicPr>
+                    <pic:cNvPr id="940812342" name=""/>
+                    <pic:cNvPicPr/>
+                  </pic:nvPicPr>
+                  <pic:blipFill>
+                    <a:blip r:embed="rId10"/>
+                    <a:stretch>
+                      <a:fillRect/>
+                    </a:stretch>
+                  </pic:blipFill>
+                  <pic:spPr>
+                    <a:xfrm>
+                      <a:off x="0" y="0"/>
+                      <a:ext cx="5943600" cy="4027170"/>
+                    </a:xfrm>
+                    <a:prstGeom prst="rect">
+                      <a:avLst/>
+                    </a:prstGeom>
+                  </pic:spPr>
+                </pic:pic>
+              </a:graphicData>
+            </a:graphic>
+          </wp:inline>
+        </w:drawing>
+      </w:r>
+    </w:p>
+    <w:p>
+      <w:pPr>
+        <w:rPr>
+          <w:lang w:val="vi-VN"/>
+        </w:rPr>
+      </w:pPr>
+      <w:r>
+        <w:rPr>
+          <w:lang w:val="vi-VN"/>
+        </w:rPr>
+        <w:t>Xóa</w:t>
+      </w:r>
+    </w:p>
+    <w:p>
+      <w:pPr>
+        <w:rPr>
+          <w:lang w:val="vi-VN"/>
+        </w:rPr>
+      </w:pPr>
+      <w:r>
+        <w:rPr>
+          <w:lang w:val="vi-VN"/>
+        </w:rPr>
+        <w:lastRenderedPageBreak/>
+        <w:drawing>
+          <wp:inline distT="0" distB="0" distL="0" distR="0" wp14:anchorId="1C6B4A05" wp14:editId="755AA884">
+            <wp:extent cx="5943600" cy="4251325"/>
+            <wp:effectExtent l="0" t="0" r="0" b="0"/>
+            <wp:docPr id="1487185429" name="Hình ảnh 1"/>
+            <wp:cNvGraphicFramePr>
+              <a:graphicFrameLocks xmlns:a="http://schemas.openxmlformats.org/drawingml/2006/main" noChangeAspect="1"/>
+            </wp:cNvGraphicFramePr>
+            <a:graphic xmlns:a="http://schemas.openxmlformats.org/drawingml/2006/main">
+              <a:graphicData uri="http://schemas.openxmlformats.org/drawingml/2006/picture">
+                <pic:pic xmlns:pic="http://schemas.openxmlformats.org/drawingml/2006/picture">
+                  <pic:nvPicPr>
+                    <pic:cNvPr id="1487185429" name=""/>
+                    <pic:cNvPicPr/>
+                  </pic:nvPicPr>
+                  <pic:blipFill>
+                    <a:blip r:embed="rId11"/>
+                    <a:stretch>
+                      <a:fillRect/>
+                    </a:stretch>
+                  </pic:blipFill>
+                  <pic:spPr>
+                    <a:xfrm>
+                      <a:off x="0" y="0"/>
+                      <a:ext cx="5943600" cy="4251325"/>
+                    </a:xfrm>
+                    <a:prstGeom prst="rect">
+                      <a:avLst/>
+                    </a:prstGeom>
+                  </pic:spPr>
+                </pic:pic>
+              </a:graphicData>
+            </a:graphic>
+          </wp:inline>
+        </w:drawing>
+      </w:r>
+    </w:p>
+    <w:p>
+      <w:pPr>
+        <w:rPr>
+          <w:lang w:val="vi-VN"/>
+        </w:rPr>
+      </w:pPr>
+      <w:r>
+        <w:rPr>
+          <w:lang w:val="vi-VN"/>
+        </w:rPr>
+        <w:t>Tìm kiếm</w:t>
+      </w:r>
+    </w:p>
+    <w:p>
+      <w:pPr>
+        <w:rPr>
+          <w:lang w:val="vi-VN"/>
+        </w:rPr>
+      </w:pPr>
+      <w:r>
+        <w:rPr>
+          <w:lang w:val="vi-VN"/>
+        </w:rPr>
+        <w:lastRenderedPageBreak/>
+        <w:drawing>
+          <wp:inline distT="0" distB="0" distL="0" distR="0" wp14:anchorId="455D6A25" wp14:editId="32C0594B">
+            <wp:extent cx="5943600" cy="4266565"/>
+            <wp:effectExtent l="0" t="0" r="0" b="635"/>
+            <wp:docPr id="487294883" name="Hình ảnh 1"/>
+            <wp:cNvGraphicFramePr>
+              <a:graphicFrameLocks xmlns:a="http://schemas.openxmlformats.org/drawingml/2006/main" noChangeAspect="1"/>
+            </wp:cNvGraphicFramePr>
+            <a:graphic xmlns:a="http://schemas.openxmlformats.org/drawingml/2006/main">
+              <a:graphicData uri="http://schemas.openxmlformats.org/drawingml/2006/picture">
+                <pic:pic xmlns:pic="http://schemas.openxmlformats.org/drawingml/2006/picture">
+                  <pic:nvPicPr>
+                    <pic:cNvPr id="487294883" name=""/>
+                    <pic:cNvPicPr/>
+                  </pic:nvPicPr>
+                  <pic:blipFill>
+                    <a:blip r:embed="rId12"/>
+                    <a:stretch>
+                      <a:fillRect/>
+                    </a:stretch>
+                  </pic:blipFill>
+                  <pic:spPr>
+                    <a:xfrm>
+                      <a:off x="0" y="0"/>
+                      <a:ext cx="5943600" cy="4266565"/>
+                    </a:xfrm>
+                    <a:prstGeom prst="rect">
+                      <a:avLst/>
+                    </a:prstGeom>
+                  </pic:spPr>
+                </pic:pic>
+              </a:graphicData>
+            </a:graphic>
+          </wp:inline>
+        </w:drawing>
       </w:r>
     </w:p>
     <w:p>

</xml_diff>